<commit_message>
correction of formateting and grammar in the documents
</commit_message>
<xml_diff>
--- a/task-4-email-etiquette/Inquiry_Regarding_Summer_Internship_Opportunity.docx
+++ b/task-4-email-etiquette/Inquiry_Regarding_Summer_Internship_Opportunity.docx
@@ -4,6 +4,53 @@
   <w:body>
     <w:p>
       <w:r>
+        <w:t xml:space="preserve">To: </w:t>
+      </w:r>
+      <w:r>
+        <w:t>internship</w:t>
+      </w:r>
+      <w:r>
+        <w:t>@c</w:t>
+      </w:r>
+      <w:r>
+        <w:t>ompany.com</w:t>
+      </w:r>
+    </w:p>
+    <w:p>
+      <w:r>
+        <w:t>Fr</w:t>
+      </w:r>
+      <w:r>
+        <w:t>om: student@vitbhopal.ac.in</w:t>
+      </w:r>
+    </w:p>
+    <w:p>
+      <w:r>
+        <w:t>Date: 2</w:t>
+      </w:r>
+      <w:r>
+        <w:t>8</w:t>
+      </w:r>
+      <w:r>
+        <w:t xml:space="preserve"> March 2026</w:t>
+      </w:r>
+    </w:p>
+    <w:p>
+      <w:r>
+        <w:t>C</w:t>
+      </w:r>
+      <w:r>
+        <w:t>C</w:t>
+      </w:r>
+      <w:r>
+        <w:t xml:space="preserve">: </w:t>
+      </w:r>
+      <w:r>
+        <w:t>-</w:t>
+      </w:r>
+    </w:p>
+    <w:p>
+      <w:r>
         <w:t xml:space="preserve">Subject - </w:t>
       </w:r>
       <w:r>
@@ -42,18 +89,13 @@
         <w:t>Varchasv Goswami</w:t>
       </w:r>
       <w:r>
-        <w:t xml:space="preserve">, and I am currently a student </w:t>
-      </w:r>
-      <w:proofErr w:type="gramStart"/>
-      <w:r>
-        <w:t xml:space="preserve">pursuing </w:t>
-      </w:r>
-      <w:r>
-        <w:t xml:space="preserve"> B</w:t>
-      </w:r>
-      <w:proofErr w:type="gramEnd"/>
-      <w:r>
-        <w:t>.TECH CSE (AI&amp;ML)</w:t>
+        <w:t xml:space="preserve">, and I am currently a student pursuing </w:t>
+      </w:r>
+      <w:r>
+        <w:t xml:space="preserve"> </w:t>
+      </w:r>
+      <w:r>
+        <w:t xml:space="preserve"> B.TECH CSE (AI&amp;ML)</w:t>
       </w:r>
       <w:r>
         <w:t xml:space="preserve"> at </w:t>
@@ -708,6 +750,7 @@
   <w:style w:type="character" w:default="1" w:styleId="DefaultParagraphFont">
     <w:name w:val="Default Paragraph Font"/>
     <w:uiPriority w:val="1"/>
+    <w:semiHidden/>
     <w:unhideWhenUsed/>
   </w:style>
   <w:style w:type="table" w:default="1" w:styleId="TableNormal">

</xml_diff>